<commit_message>
Relocate Table 10 (Between-group Hedges' g, T3) to Section 4.5
- Table 10 (Between-group Hedges' g, Delta Baseline-T3) and its
  accompanying Figure 2 forest plot moved from Results 3.3 to the end
  of Discussion 4.5 (Comparison Between Active Groups), immediately
  before 4.6 (Clinical Implications), per author's request
- Added new lead-in paragraph on durability of 3-month effect sizes
- Section 3.3 now references the Discussion sections (4.1, 4.2, 4.5)
  where Tables 8-10 are presented, instead of containing Table 10 itself
- Updated cross-reference in Section 4.3 to point to Table 10's new
  location in Section 4.5

Co-authored-by: Arshiya Asadi <arshiyaasadi@users.noreply.github.com>
</commit_message>
<xml_diff>
--- a/paper-export/TENS-Migraine-Trial.docx
+++ b/paper-export/TENS-Migraine-Trial.docx
@@ -3591,819 +3591,9 @@
         <w:pStyle w:val="BodyText"/>
       </w:pPr>
       <w:r>
-        <w:t xml:space="preserve">Between-group standardized effect sizes (Hedges’ g) at the 3-month endpoint are presented in Table 10; the corresponding 1-month interim effect sizes are presented separately in the Discussion (Sections 4.1 and 4.2, Tables 8–9), where they are used to contextualize the temporal pattern of treatment response.</w:t>
-      </w:r>
-    </w:p>
-    <w:p>
-      <w:pPr>
-        <w:pStyle w:val="BodyText"/>
-      </w:pPr>
-      <w:r>
-        <w:rPr>
-          <w:bCs/>
-          <w:b/>
-        </w:rPr>
-        <w:t xml:space="preserve">Table 10.</w:t>
-      </w:r>
-      <w:r>
-        <w:t xml:space="preserve"> </w:t>
-      </w:r>
-      <w:r>
-        <w:t xml:space="preserve">Between-group Hedges’ g (Δ Baseline − 3 Months). Negative values favor the first-named group (lower scores = improvement).</w:t>
-      </w:r>
-    </w:p>
-    <w:tbl>
-      <w:tblPr>
-        <w:tblStyle w:val="Table"/>
-        <w:tblW w:type="pct" w:w="5000"/>
-        <w:tblLook w:firstRow="1" w:lastRow="0" w:firstColumn="0" w:lastColumn="0" w:noHBand="0" w:noVBand="0" w:val="0020"/>
-        <w:jc w:val="start"/>
-      </w:tblPr>
-      <w:tblGrid>
-        <w:gridCol w:w="1980"/>
-        <w:gridCol w:w="1980"/>
-        <w:gridCol w:w="1980"/>
-        <w:gridCol w:w="1980"/>
-      </w:tblGrid>
-      <w:tr>
-        <w:trPr>
-          <w:tblHeader w:val="true"/>
-        </w:trPr>
-        <w:tc>
-          <w:tcPr/>
-          <w:p>
-            <w:pPr>
-              <w:pStyle w:val="Compact"/>
-              <w:jc w:val="left"/>
-            </w:pPr>
-            <w:r>
-              <w:t xml:space="preserve">Outcome</w:t>
-            </w:r>
-          </w:p>
-        </w:tc>
-        <w:tc>
-          <w:tcPr/>
-          <w:p>
-            <w:pPr>
-              <w:pStyle w:val="Compact"/>
-              <w:jc w:val="left"/>
-            </w:pPr>
-            <w:r>
-              <w:t xml:space="preserve">Group1 vs Group3 g [95% CI]</w:t>
-            </w:r>
-          </w:p>
-        </w:tc>
-        <w:tc>
-          <w:tcPr/>
-          <w:p>
-            <w:pPr>
-              <w:pStyle w:val="Compact"/>
-              <w:jc w:val="left"/>
-            </w:pPr>
-            <w:r>
-              <w:t xml:space="preserve">Group2 vs Group3 g [95% CI]</w:t>
-            </w:r>
-          </w:p>
-        </w:tc>
-        <w:tc>
-          <w:tcPr/>
-          <w:p>
-            <w:pPr>
-              <w:pStyle w:val="Compact"/>
-              <w:jc w:val="left"/>
-            </w:pPr>
-            <w:r>
-              <w:t xml:space="preserve">Group1 vs Group2 g [95% CI]</w:t>
-            </w:r>
-          </w:p>
-        </w:tc>
-      </w:tr>
-      <w:tr>
-        <w:tc>
-          <w:tcPr/>
-          <w:p>
-            <w:pPr>
-              <w:pStyle w:val="Compact"/>
-              <w:jc w:val="left"/>
-            </w:pPr>
-            <w:r>
-              <w:t xml:space="preserve">MPQ5</w:t>
-            </w:r>
-          </w:p>
-        </w:tc>
-        <w:tc>
-          <w:tcPr/>
-          <w:p>
-            <w:pPr>
-              <w:pStyle w:val="Compact"/>
-              <w:jc w:val="left"/>
-            </w:pPr>
-            <w:r>
-              <w:t xml:space="preserve">1.52 [0.93, 2.10]</w:t>
-            </w:r>
-          </w:p>
-        </w:tc>
-        <w:tc>
-          <w:tcPr/>
-          <w:p>
-            <w:pPr>
-              <w:pStyle w:val="Compact"/>
-              <w:jc w:val="left"/>
-            </w:pPr>
-            <w:r>
-              <w:t xml:space="preserve">1.75 [1.14, 2.37]</w:t>
-            </w:r>
-          </w:p>
-        </w:tc>
-        <w:tc>
-          <w:tcPr/>
-          <w:p>
-            <w:pPr>
-              <w:pStyle w:val="Compact"/>
-              <w:jc w:val="left"/>
-            </w:pPr>
-            <w:r>
-              <w:t xml:space="preserve">−0.26 [−0.79, 0.26]</w:t>
-            </w:r>
-          </w:p>
-        </w:tc>
-      </w:tr>
-      <w:tr>
-        <w:tc>
-          <w:tcPr/>
-          <w:p>
-            <w:pPr>
-              <w:pStyle w:val="Compact"/>
-              <w:jc w:val="left"/>
-            </w:pPr>
-            <w:r>
-              <w:t xml:space="preserve">VAS</w:t>
-            </w:r>
-          </w:p>
-        </w:tc>
-        <w:tc>
-          <w:tcPr/>
-          <w:p>
-            <w:pPr>
-              <w:pStyle w:val="Compact"/>
-              <w:jc w:val="left"/>
-            </w:pPr>
-            <w:r>
-              <w:t xml:space="preserve">1.84 [1.22, 2.46]</w:t>
-            </w:r>
-          </w:p>
-        </w:tc>
-        <w:tc>
-          <w:tcPr/>
-          <w:p>
-            <w:pPr>
-              <w:pStyle w:val="Compact"/>
-              <w:jc w:val="left"/>
-            </w:pPr>
-            <w:r>
-              <w:t xml:space="preserve">1.35 [0.77, 1.93]</w:t>
-            </w:r>
-          </w:p>
-        </w:tc>
-        <w:tc>
-          <w:tcPr/>
-          <w:p>
-            <w:pPr>
-              <w:pStyle w:val="Compact"/>
-              <w:jc w:val="left"/>
-            </w:pPr>
-            <w:r>
-              <w:t xml:space="preserve">0.11 [−0.41, 0.63]</w:t>
-            </w:r>
-          </w:p>
-        </w:tc>
-      </w:tr>
-      <w:tr>
-        <w:tc>
-          <w:tcPr/>
-          <w:p>
-            <w:pPr>
-              <w:pStyle w:val="Compact"/>
-              <w:jc w:val="left"/>
-            </w:pPr>
-            <w:r>
-              <w:t xml:space="preserve">MIDAS</w:t>
-            </w:r>
-          </w:p>
-        </w:tc>
-        <w:tc>
-          <w:tcPr/>
-          <w:p>
-            <w:pPr>
-              <w:pStyle w:val="Compact"/>
-              <w:jc w:val="left"/>
-            </w:pPr>
-            <w:r>
-              <w:t xml:space="preserve">1.11 [0.55, 1.66]</w:t>
-            </w:r>
-          </w:p>
-        </w:tc>
-        <w:tc>
-          <w:tcPr/>
-          <w:p>
-            <w:pPr>
-              <w:pStyle w:val="Compact"/>
-              <w:jc w:val="left"/>
-            </w:pPr>
-            <w:r>
-              <w:t xml:space="preserve">0.66 [0.12, 1.19]</w:t>
-            </w:r>
-          </w:p>
-        </w:tc>
-        <w:tc>
-          <w:tcPr/>
-          <w:p>
-            <w:pPr>
-              <w:pStyle w:val="Compact"/>
-              <w:jc w:val="left"/>
-            </w:pPr>
-            <w:r>
-              <w:t xml:space="preserve">0.43 [−0.10, 0.96]</w:t>
-            </w:r>
-          </w:p>
-        </w:tc>
-      </w:tr>
-      <w:tr>
-        <w:tc>
-          <w:tcPr/>
-          <w:p>
-            <w:pPr>
-              <w:pStyle w:val="Compact"/>
-              <w:jc w:val="left"/>
-            </w:pPr>
-            <w:r>
-              <w:t xml:space="preserve">HIT-6</w:t>
-            </w:r>
-          </w:p>
-        </w:tc>
-        <w:tc>
-          <w:tcPr/>
-          <w:p>
-            <w:pPr>
-              <w:pStyle w:val="Compact"/>
-              <w:jc w:val="left"/>
-            </w:pPr>
-            <w:r>
-              <w:t xml:space="preserve">2.14 [1.49, 2.79]</w:t>
-            </w:r>
-          </w:p>
-        </w:tc>
-        <w:tc>
-          <w:tcPr/>
-          <w:p>
-            <w:pPr>
-              <w:pStyle w:val="Compact"/>
-              <w:jc w:val="left"/>
-            </w:pPr>
-            <w:r>
-              <w:t xml:space="preserve">2.44 [1.75, 3.14]</w:t>
-            </w:r>
-          </w:p>
-        </w:tc>
-        <w:tc>
-          <w:tcPr/>
-          <w:p>
-            <w:pPr>
-              <w:pStyle w:val="Compact"/>
-              <w:jc w:val="left"/>
-            </w:pPr>
-            <w:r>
-              <w:t xml:space="preserve">0.04 [−0.48, 0.56]</w:t>
-            </w:r>
-          </w:p>
-        </w:tc>
-      </w:tr>
-      <w:tr>
-        <w:tc>
-          <w:tcPr/>
-          <w:p>
-            <w:pPr>
-              <w:pStyle w:val="Compact"/>
-              <w:jc w:val="left"/>
-            </w:pPr>
-            <w:r>
-              <w:t xml:space="preserve">Freq. Preventive</w:t>
-            </w:r>
-          </w:p>
-        </w:tc>
-        <w:tc>
-          <w:tcPr/>
-          <w:p>
-            <w:pPr>
-              <w:pStyle w:val="Compact"/>
-              <w:jc w:val="left"/>
-            </w:pPr>
-            <w:r>
-              <w:t xml:space="preserve">1.48 [0.90, 2.07]</w:t>
-            </w:r>
-          </w:p>
-        </w:tc>
-        <w:tc>
-          <w:tcPr/>
-          <w:p>
-            <w:pPr>
-              <w:pStyle w:val="Compact"/>
-              <w:jc w:val="left"/>
-            </w:pPr>
-            <w:r>
-              <w:t xml:space="preserve">1.35 [0.77, 1.93]</w:t>
-            </w:r>
-          </w:p>
-        </w:tc>
-        <w:tc>
-          <w:tcPr/>
-          <w:p>
-            <w:pPr>
-              <w:pStyle w:val="Compact"/>
-              <w:jc w:val="left"/>
-            </w:pPr>
-            <w:r>
-              <w:t xml:space="preserve">0.15 [−0.37, 0.67]</w:t>
-            </w:r>
-          </w:p>
-        </w:tc>
-      </w:tr>
-      <w:tr>
-        <w:tc>
-          <w:tcPr/>
-          <w:p>
-            <w:pPr>
-              <w:pStyle w:val="Compact"/>
-              <w:jc w:val="left"/>
-            </w:pPr>
-            <w:r>
-              <w:t xml:space="preserve">Need Preventive</w:t>
-            </w:r>
-          </w:p>
-        </w:tc>
-        <w:tc>
-          <w:tcPr/>
-          <w:p>
-            <w:pPr>
-              <w:pStyle w:val="Compact"/>
-              <w:jc w:val="left"/>
-            </w:pPr>
-            <w:r>
-              <w:t xml:space="preserve">1.17 [0.60, 1.72]</w:t>
-            </w:r>
-          </w:p>
-        </w:tc>
-        <w:tc>
-          <w:tcPr/>
-          <w:p>
-            <w:pPr>
-              <w:pStyle w:val="Compact"/>
-              <w:jc w:val="left"/>
-            </w:pPr>
-            <w:r>
-              <w:t xml:space="preserve">1.20 [0.64, 1.77]</w:t>
-            </w:r>
-          </w:p>
-        </w:tc>
-        <w:tc>
-          <w:tcPr/>
-          <w:p>
-            <w:pPr>
-              <w:pStyle w:val="Compact"/>
-              <w:jc w:val="left"/>
-            </w:pPr>
-            <w:r>
-              <w:t xml:space="preserve">−0.28 [−0.80, 0.25]</w:t>
-            </w:r>
-          </w:p>
-        </w:tc>
-      </w:tr>
-    </w:tbl>
-    <w:p>
-      <w:pPr>
-        <w:pStyle w:val="BodyText"/>
-      </w:pPr>
-      <w:r>
-        <w:rPr>
-          <w:iCs/>
-          <w:i/>
-        </w:rPr>
-        <w:t xml:space="preserve">Note: |g| ≈ 0.2 small, 0.5 medium, 0.8 large, ≥ 1.2 very large.</w:t>
-      </w:r>
-    </w:p>
-    <w:p>
-      <w:pPr>
-        <w:pStyle w:val="BodyText"/>
-      </w:pPr>
-      <w:r>
-        <w:rPr>
-          <w:bCs/>
-          <w:b/>
-        </w:rPr>
-        <w:t xml:space="preserve">Figure 2</w:t>
-      </w:r>
-      <w:r>
-        <w:t xml:space="preserve"> </w:t>
-      </w:r>
-      <w:r>
-        <w:rPr>
-          <w:iCs/>
-          <w:i/>
-        </w:rPr>
-        <w:t xml:space="preserve">(insert here — forest plot:</w:t>
-      </w:r>
-      <w:r>
-        <w:rPr>
-          <w:iCs/>
-          <w:i/>
-        </w:rPr>
-        <w:t xml:space="preserve"> </w:t>
-      </w:r>
-      <w:r>
-        <w:rPr>
-          <w:iCs/>
-          <w:i/>
-        </w:rPr>
-        <w:t xml:space="preserve">“</w:t>
-      </w:r>
-      <w:r>
-        <w:rPr>
-          <w:iCs/>
-          <w:i/>
-        </w:rPr>
-        <w:t xml:space="preserve">Between-group Hedges’ g at Final Follow-up (T3), Group1/Group2 vs Group3, based on Δ = Baseline−Follow-up</w:t>
-      </w:r>
-      <w:r>
-        <w:rPr>
-          <w:iCs/>
-          <w:i/>
-        </w:rPr>
-        <w:t xml:space="preserve">”</w:t>
-      </w:r>
-      <w:r>
-        <w:rPr>
-          <w:iCs/>
-          <w:i/>
-        </w:rPr>
-        <w:t xml:space="preserve">)</w:t>
-      </w:r>
-      <w:r>
-        <w:t xml:space="preserve">. This figure visualizes the Table 10 data above:</w:t>
-      </w:r>
-    </w:p>
-    <w:tbl>
-      <w:tblPr>
-        <w:tblStyle w:val="Table"/>
-        <w:tblW w:type="pct" w:w="5000"/>
-        <w:tblLook w:firstRow="1" w:lastRow="0" w:firstColumn="0" w:lastColumn="0" w:noHBand="0" w:noVBand="0" w:val="0020"/>
-        <w:jc w:val="start"/>
-      </w:tblPr>
-      <w:tblGrid>
-        <w:gridCol w:w="3960"/>
-        <w:gridCol w:w="3960"/>
-      </w:tblGrid>
-      <w:tr>
-        <w:trPr>
-          <w:tblHeader w:val="true"/>
-        </w:trPr>
-        <w:tc>
-          <w:tcPr/>
-          <w:p>
-            <w:pPr>
-              <w:pStyle w:val="Compact"/>
-              <w:jc w:val="left"/>
-            </w:pPr>
-            <w:r>
-              <w:t xml:space="preserve">Comparison</w:t>
-            </w:r>
-          </w:p>
-        </w:tc>
-        <w:tc>
-          <w:tcPr/>
-          <w:p>
-            <w:pPr>
-              <w:pStyle w:val="Compact"/>
-              <w:jc w:val="left"/>
-            </w:pPr>
-            <w:r>
-              <w:t xml:space="preserve">g [95% CI]</w:t>
-            </w:r>
-          </w:p>
-        </w:tc>
-      </w:tr>
-      <w:tr>
-        <w:tc>
-          <w:tcPr/>
-          <w:p>
-            <w:pPr>
-              <w:pStyle w:val="Compact"/>
-              <w:jc w:val="left"/>
-            </w:pPr>
-            <w:r>
-              <w:t xml:space="preserve">MPQ5 — Group1 vs Group3</w:t>
-            </w:r>
-          </w:p>
-        </w:tc>
-        <w:tc>
-          <w:tcPr/>
-          <w:p>
-            <w:pPr>
-              <w:pStyle w:val="Compact"/>
-              <w:jc w:val="left"/>
-            </w:pPr>
-            <w:r>
-              <w:t xml:space="preserve">1.52 [0.93, 2.10]</w:t>
-            </w:r>
-          </w:p>
-        </w:tc>
-      </w:tr>
-      <w:tr>
-        <w:tc>
-          <w:tcPr/>
-          <w:p>
-            <w:pPr>
-              <w:pStyle w:val="Compact"/>
-              <w:jc w:val="left"/>
-            </w:pPr>
-            <w:r>
-              <w:t xml:space="preserve">MPQ5 — Group2 vs Group3</w:t>
-            </w:r>
-          </w:p>
-        </w:tc>
-        <w:tc>
-          <w:tcPr/>
-          <w:p>
-            <w:pPr>
-              <w:pStyle w:val="Compact"/>
-              <w:jc w:val="left"/>
-            </w:pPr>
-            <w:r>
-              <w:t xml:space="preserve">1.75 [1.14, 2.37]</w:t>
-            </w:r>
-          </w:p>
-        </w:tc>
-      </w:tr>
-      <w:tr>
-        <w:tc>
-          <w:tcPr/>
-          <w:p>
-            <w:pPr>
-              <w:pStyle w:val="Compact"/>
-              <w:jc w:val="left"/>
-            </w:pPr>
-            <w:r>
-              <w:t xml:space="preserve">VAS — Group1 vs Group3</w:t>
-            </w:r>
-          </w:p>
-        </w:tc>
-        <w:tc>
-          <w:tcPr/>
-          <w:p>
-            <w:pPr>
-              <w:pStyle w:val="Compact"/>
-              <w:jc w:val="left"/>
-            </w:pPr>
-            <w:r>
-              <w:t xml:space="preserve">1.84 [1.22, 2.46]</w:t>
-            </w:r>
-          </w:p>
-        </w:tc>
-      </w:tr>
-      <w:tr>
-        <w:tc>
-          <w:tcPr/>
-          <w:p>
-            <w:pPr>
-              <w:pStyle w:val="Compact"/>
-              <w:jc w:val="left"/>
-            </w:pPr>
-            <w:r>
-              <w:t xml:space="preserve">VAS — Group2 vs Group3</w:t>
-            </w:r>
-          </w:p>
-        </w:tc>
-        <w:tc>
-          <w:tcPr/>
-          <w:p>
-            <w:pPr>
-              <w:pStyle w:val="Compact"/>
-              <w:jc w:val="left"/>
-            </w:pPr>
-            <w:r>
-              <w:t xml:space="preserve">1.35 [0.77, 1.93]</w:t>
-            </w:r>
-          </w:p>
-        </w:tc>
-      </w:tr>
-      <w:tr>
-        <w:tc>
-          <w:tcPr/>
-          <w:p>
-            <w:pPr>
-              <w:pStyle w:val="Compact"/>
-              <w:jc w:val="left"/>
-            </w:pPr>
-            <w:r>
-              <w:t xml:space="preserve">MIDAS — Group1 vs Group3</w:t>
-            </w:r>
-          </w:p>
-        </w:tc>
-        <w:tc>
-          <w:tcPr/>
-          <w:p>
-            <w:pPr>
-              <w:pStyle w:val="Compact"/>
-              <w:jc w:val="left"/>
-            </w:pPr>
-            <w:r>
-              <w:t xml:space="preserve">1.11 [0.55, 1.66]</w:t>
-            </w:r>
-          </w:p>
-        </w:tc>
-      </w:tr>
-      <w:tr>
-        <w:tc>
-          <w:tcPr/>
-          <w:p>
-            <w:pPr>
-              <w:pStyle w:val="Compact"/>
-              <w:jc w:val="left"/>
-            </w:pPr>
-            <w:r>
-              <w:t xml:space="preserve">MIDAS — Group2 vs Group3</w:t>
-            </w:r>
-          </w:p>
-        </w:tc>
-        <w:tc>
-          <w:tcPr/>
-          <w:p>
-            <w:pPr>
-              <w:pStyle w:val="Compact"/>
-              <w:jc w:val="left"/>
-            </w:pPr>
-            <w:r>
-              <w:t xml:space="preserve">0.66 [0.12, 1.19]</w:t>
-            </w:r>
-          </w:p>
-        </w:tc>
-      </w:tr>
-      <w:tr>
-        <w:tc>
-          <w:tcPr/>
-          <w:p>
-            <w:pPr>
-              <w:pStyle w:val="Compact"/>
-              <w:jc w:val="left"/>
-            </w:pPr>
-            <w:r>
-              <w:t xml:space="preserve">HIT-6 — Group1 vs Group3</w:t>
-            </w:r>
-          </w:p>
-        </w:tc>
-        <w:tc>
-          <w:tcPr/>
-          <w:p>
-            <w:pPr>
-              <w:pStyle w:val="Compact"/>
-              <w:jc w:val="left"/>
-            </w:pPr>
-            <w:r>
-              <w:t xml:space="preserve">2.14 [1.49, 2.79]</w:t>
-            </w:r>
-          </w:p>
-        </w:tc>
-      </w:tr>
-      <w:tr>
-        <w:tc>
-          <w:tcPr/>
-          <w:p>
-            <w:pPr>
-              <w:pStyle w:val="Compact"/>
-              <w:jc w:val="left"/>
-            </w:pPr>
-            <w:r>
-              <w:t xml:space="preserve">HIT-6 — Group2 vs Group3</w:t>
-            </w:r>
-          </w:p>
-        </w:tc>
-        <w:tc>
-          <w:tcPr/>
-          <w:p>
-            <w:pPr>
-              <w:pStyle w:val="Compact"/>
-              <w:jc w:val="left"/>
-            </w:pPr>
-            <w:r>
-              <w:t xml:space="preserve">2.44 [1.75, 3.14]</w:t>
-            </w:r>
-          </w:p>
-        </w:tc>
-      </w:tr>
-      <w:tr>
-        <w:tc>
-          <w:tcPr/>
-          <w:p>
-            <w:pPr>
-              <w:pStyle w:val="Compact"/>
-              <w:jc w:val="left"/>
-            </w:pPr>
-            <w:r>
-              <w:t xml:space="preserve">Frequency of Preventive Med. Use — Group1 vs Group3</w:t>
-            </w:r>
-          </w:p>
-        </w:tc>
-        <w:tc>
-          <w:tcPr/>
-          <w:p>
-            <w:pPr>
-              <w:pStyle w:val="Compact"/>
-              <w:jc w:val="left"/>
-            </w:pPr>
-            <w:r>
-              <w:t xml:space="preserve">1.48 [0.90, 2.07]</w:t>
-            </w:r>
-          </w:p>
-        </w:tc>
-      </w:tr>
-      <w:tr>
-        <w:tc>
-          <w:tcPr/>
-          <w:p>
-            <w:pPr>
-              <w:pStyle w:val="Compact"/>
-              <w:jc w:val="left"/>
-            </w:pPr>
-            <w:r>
-              <w:t xml:space="preserve">Frequency of Preventive Med. Use — Group2 vs Group3</w:t>
-            </w:r>
-          </w:p>
-        </w:tc>
-        <w:tc>
-          <w:tcPr/>
-          <w:p>
-            <w:pPr>
-              <w:pStyle w:val="Compact"/>
-              <w:jc w:val="left"/>
-            </w:pPr>
-            <w:r>
-              <w:t xml:space="preserve">1.35 [0.77, 1.93]</w:t>
-            </w:r>
-          </w:p>
-        </w:tc>
-      </w:tr>
-      <w:tr>
-        <w:tc>
-          <w:tcPr/>
-          <w:p>
-            <w:pPr>
-              <w:pStyle w:val="Compact"/>
-              <w:jc w:val="left"/>
-            </w:pPr>
-            <w:r>
-              <w:t xml:space="preserve">Need for Preventive Medication — Group1 vs Group3</w:t>
-            </w:r>
-          </w:p>
-        </w:tc>
-        <w:tc>
-          <w:tcPr/>
-          <w:p>
-            <w:pPr>
-              <w:pStyle w:val="Compact"/>
-              <w:jc w:val="left"/>
-            </w:pPr>
-            <w:r>
-              <w:t xml:space="preserve">1.17 [0.60, 1.72]</w:t>
-            </w:r>
-          </w:p>
-        </w:tc>
-      </w:tr>
-      <w:tr>
-        <w:tc>
-          <w:tcPr/>
-          <w:p>
-            <w:pPr>
-              <w:pStyle w:val="Compact"/>
-              <w:jc w:val="left"/>
-            </w:pPr>
-            <w:r>
-              <w:t xml:space="preserve">Need for Preventive Medication — Group2 vs Group3</w:t>
-            </w:r>
-          </w:p>
-        </w:tc>
-        <w:tc>
-          <w:tcPr/>
-          <w:p>
-            <w:pPr>
-              <w:pStyle w:val="Compact"/>
-              <w:jc w:val="left"/>
-            </w:pPr>
-            <w:r>
-              <w:t xml:space="preserve">1.20 [0.64, 1.77]</w:t>
-            </w:r>
-          </w:p>
-        </w:tc>
-      </w:tr>
-    </w:tbl>
+        <w:t xml:space="preserve">Between-group standardized effect sizes (Hedges’ g) are reported alongside the Discussion, where they are used to contextualize the magnitude and temporal pattern of treatment response relative to sham and between the two active stimulation sites: the 1-month interim estimates are presented in Sections 4.1–4.2 (Tables 8–9), and the 3-month (final follow-up) estimates are presented in Section 4.5 (Table 10).</w:t>
+      </w:r>
+    </w:p>
     <w:bookmarkEnd w:id="38"/>
     <w:bookmarkStart w:id="39" w:name="adverse-events-and-tolerability"/>
     <w:p>
@@ -5671,7 +4861,7 @@
         <w:pStyle w:val="BodyText"/>
       </w:pPr>
       <w:r>
-        <w:t xml:space="preserve">The supplementary 1-month effect-size analyses presented in Sections 4.1–4.2 (Tables 8–9) are consistent with this descriptive pattern: at 1 month, the between-group Hedges’ g for VAS is already large for supraorbital-vs-sham (g = 1.35, Table 9) but comparatively smaller for infraorbital-vs-sham (g = 0.63, Table 9), narrowing to comparable magnitudes by 3 months (Table 10: g = 1.84 vs g = 1.35).</w:t>
+        <w:t xml:space="preserve">The supplementary 1-month effect-size analyses presented in Sections 4.1–4.2 (Tables 8–9) are consistent with this descriptive pattern: at 1 month, the between-group Hedges’ g for VAS is already large for supraorbital-vs-sham (g = 1.35, Table 9) but comparatively smaller for infraorbital-vs-sham (g = 0.63, Table 9), narrowing to comparable magnitudes by 3 months (Table 10, Section 4.5: g = 1.84 vs g = 1.35).</w:t>
       </w:r>
     </w:p>
     <w:p>
@@ -6021,6 +5211,824 @@
             </w:pPr>
             <w:r>
               <w:t xml:space="preserve">43.9%</w:t>
+            </w:r>
+          </w:p>
+        </w:tc>
+      </w:tr>
+    </w:tbl>
+    <w:p>
+      <w:pPr>
+        <w:pStyle w:val="BodyText"/>
+      </w:pPr>
+      <w:r>
+        <w:t xml:space="preserve">Effect size estimates at the 3-month follow-up confirmed the durability of treatment benefits. Both active stimulation protocols showed consistently large between-group effects compared with sham across all clinical outcomes (Hedges’ g generally &gt;1.0), whereas direct comparisons between supraorbital and infraorbital stimulation yielded trivial or small effect sizes with confidence intervals crossing zero, reinforcing the conclusion that neither stimulation site demonstrated clinically relevant superiority over the other (Table 10).</w:t>
+      </w:r>
+    </w:p>
+    <w:p>
+      <w:pPr>
+        <w:pStyle w:val="BodyText"/>
+      </w:pPr>
+      <w:r>
+        <w:rPr>
+          <w:bCs/>
+          <w:b/>
+        </w:rPr>
+        <w:t xml:space="preserve">Table 10.</w:t>
+      </w:r>
+      <w:r>
+        <w:t xml:space="preserve"> </w:t>
+      </w:r>
+      <w:r>
+        <w:t xml:space="preserve">Between-group Hedges’ g (Δ Baseline − 3 Months). Negative values favor the first-named group (lower scores = improvement).</w:t>
+      </w:r>
+    </w:p>
+    <w:tbl>
+      <w:tblPr>
+        <w:tblStyle w:val="Table"/>
+        <w:tblW w:type="pct" w:w="5000"/>
+        <w:tblLook w:firstRow="1" w:lastRow="0" w:firstColumn="0" w:lastColumn="0" w:noHBand="0" w:noVBand="0" w:val="0020"/>
+        <w:jc w:val="start"/>
+      </w:tblPr>
+      <w:tblGrid>
+        <w:gridCol w:w="1980"/>
+        <w:gridCol w:w="1980"/>
+        <w:gridCol w:w="1980"/>
+        <w:gridCol w:w="1980"/>
+      </w:tblGrid>
+      <w:tr>
+        <w:trPr>
+          <w:tblHeader w:val="true"/>
+        </w:trPr>
+        <w:tc>
+          <w:tcPr/>
+          <w:p>
+            <w:pPr>
+              <w:pStyle w:val="Compact"/>
+              <w:jc w:val="left"/>
+            </w:pPr>
+            <w:r>
+              <w:t xml:space="preserve">Outcome</w:t>
+            </w:r>
+          </w:p>
+        </w:tc>
+        <w:tc>
+          <w:tcPr/>
+          <w:p>
+            <w:pPr>
+              <w:pStyle w:val="Compact"/>
+              <w:jc w:val="left"/>
+            </w:pPr>
+            <w:r>
+              <w:t xml:space="preserve">Group1 vs Group3 g [95% CI]</w:t>
+            </w:r>
+          </w:p>
+        </w:tc>
+        <w:tc>
+          <w:tcPr/>
+          <w:p>
+            <w:pPr>
+              <w:pStyle w:val="Compact"/>
+              <w:jc w:val="left"/>
+            </w:pPr>
+            <w:r>
+              <w:t xml:space="preserve">Group2 vs Group3 g [95% CI]</w:t>
+            </w:r>
+          </w:p>
+        </w:tc>
+        <w:tc>
+          <w:tcPr/>
+          <w:p>
+            <w:pPr>
+              <w:pStyle w:val="Compact"/>
+              <w:jc w:val="left"/>
+            </w:pPr>
+            <w:r>
+              <w:t xml:space="preserve">Group1 vs Group2 g [95% CI]</w:t>
+            </w:r>
+          </w:p>
+        </w:tc>
+      </w:tr>
+      <w:tr>
+        <w:tc>
+          <w:tcPr/>
+          <w:p>
+            <w:pPr>
+              <w:pStyle w:val="Compact"/>
+              <w:jc w:val="left"/>
+            </w:pPr>
+            <w:r>
+              <w:t xml:space="preserve">MPQ5</w:t>
+            </w:r>
+          </w:p>
+        </w:tc>
+        <w:tc>
+          <w:tcPr/>
+          <w:p>
+            <w:pPr>
+              <w:pStyle w:val="Compact"/>
+              <w:jc w:val="left"/>
+            </w:pPr>
+            <w:r>
+              <w:t xml:space="preserve">1.52 [0.93, 2.10]</w:t>
+            </w:r>
+          </w:p>
+        </w:tc>
+        <w:tc>
+          <w:tcPr/>
+          <w:p>
+            <w:pPr>
+              <w:pStyle w:val="Compact"/>
+              <w:jc w:val="left"/>
+            </w:pPr>
+            <w:r>
+              <w:t xml:space="preserve">1.75 [1.14, 2.37]</w:t>
+            </w:r>
+          </w:p>
+        </w:tc>
+        <w:tc>
+          <w:tcPr/>
+          <w:p>
+            <w:pPr>
+              <w:pStyle w:val="Compact"/>
+              <w:jc w:val="left"/>
+            </w:pPr>
+            <w:r>
+              <w:t xml:space="preserve">−0.26 [−0.79, 0.26]</w:t>
+            </w:r>
+          </w:p>
+        </w:tc>
+      </w:tr>
+      <w:tr>
+        <w:tc>
+          <w:tcPr/>
+          <w:p>
+            <w:pPr>
+              <w:pStyle w:val="Compact"/>
+              <w:jc w:val="left"/>
+            </w:pPr>
+            <w:r>
+              <w:t xml:space="preserve">VAS</w:t>
+            </w:r>
+          </w:p>
+        </w:tc>
+        <w:tc>
+          <w:tcPr/>
+          <w:p>
+            <w:pPr>
+              <w:pStyle w:val="Compact"/>
+              <w:jc w:val="left"/>
+            </w:pPr>
+            <w:r>
+              <w:t xml:space="preserve">1.84 [1.22, 2.46]</w:t>
+            </w:r>
+          </w:p>
+        </w:tc>
+        <w:tc>
+          <w:tcPr/>
+          <w:p>
+            <w:pPr>
+              <w:pStyle w:val="Compact"/>
+              <w:jc w:val="left"/>
+            </w:pPr>
+            <w:r>
+              <w:t xml:space="preserve">1.35 [0.77, 1.93]</w:t>
+            </w:r>
+          </w:p>
+        </w:tc>
+        <w:tc>
+          <w:tcPr/>
+          <w:p>
+            <w:pPr>
+              <w:pStyle w:val="Compact"/>
+              <w:jc w:val="left"/>
+            </w:pPr>
+            <w:r>
+              <w:t xml:space="preserve">0.11 [−0.41, 0.63]</w:t>
+            </w:r>
+          </w:p>
+        </w:tc>
+      </w:tr>
+      <w:tr>
+        <w:tc>
+          <w:tcPr/>
+          <w:p>
+            <w:pPr>
+              <w:pStyle w:val="Compact"/>
+              <w:jc w:val="left"/>
+            </w:pPr>
+            <w:r>
+              <w:t xml:space="preserve">MIDAS</w:t>
+            </w:r>
+          </w:p>
+        </w:tc>
+        <w:tc>
+          <w:tcPr/>
+          <w:p>
+            <w:pPr>
+              <w:pStyle w:val="Compact"/>
+              <w:jc w:val="left"/>
+            </w:pPr>
+            <w:r>
+              <w:t xml:space="preserve">1.11 [0.55, 1.66]</w:t>
+            </w:r>
+          </w:p>
+        </w:tc>
+        <w:tc>
+          <w:tcPr/>
+          <w:p>
+            <w:pPr>
+              <w:pStyle w:val="Compact"/>
+              <w:jc w:val="left"/>
+            </w:pPr>
+            <w:r>
+              <w:t xml:space="preserve">0.66 [0.12, 1.19]</w:t>
+            </w:r>
+          </w:p>
+        </w:tc>
+        <w:tc>
+          <w:tcPr/>
+          <w:p>
+            <w:pPr>
+              <w:pStyle w:val="Compact"/>
+              <w:jc w:val="left"/>
+            </w:pPr>
+            <w:r>
+              <w:t xml:space="preserve">0.43 [−0.10, 0.96]</w:t>
+            </w:r>
+          </w:p>
+        </w:tc>
+      </w:tr>
+      <w:tr>
+        <w:tc>
+          <w:tcPr/>
+          <w:p>
+            <w:pPr>
+              <w:pStyle w:val="Compact"/>
+              <w:jc w:val="left"/>
+            </w:pPr>
+            <w:r>
+              <w:t xml:space="preserve">HIT-6</w:t>
+            </w:r>
+          </w:p>
+        </w:tc>
+        <w:tc>
+          <w:tcPr/>
+          <w:p>
+            <w:pPr>
+              <w:pStyle w:val="Compact"/>
+              <w:jc w:val="left"/>
+            </w:pPr>
+            <w:r>
+              <w:t xml:space="preserve">2.14 [1.49, 2.79]</w:t>
+            </w:r>
+          </w:p>
+        </w:tc>
+        <w:tc>
+          <w:tcPr/>
+          <w:p>
+            <w:pPr>
+              <w:pStyle w:val="Compact"/>
+              <w:jc w:val="left"/>
+            </w:pPr>
+            <w:r>
+              <w:t xml:space="preserve">2.44 [1.75, 3.14]</w:t>
+            </w:r>
+          </w:p>
+        </w:tc>
+        <w:tc>
+          <w:tcPr/>
+          <w:p>
+            <w:pPr>
+              <w:pStyle w:val="Compact"/>
+              <w:jc w:val="left"/>
+            </w:pPr>
+            <w:r>
+              <w:t xml:space="preserve">0.04 [−0.48, 0.56]</w:t>
+            </w:r>
+          </w:p>
+        </w:tc>
+      </w:tr>
+      <w:tr>
+        <w:tc>
+          <w:tcPr/>
+          <w:p>
+            <w:pPr>
+              <w:pStyle w:val="Compact"/>
+              <w:jc w:val="left"/>
+            </w:pPr>
+            <w:r>
+              <w:t xml:space="preserve">Freq. Preventive</w:t>
+            </w:r>
+          </w:p>
+        </w:tc>
+        <w:tc>
+          <w:tcPr/>
+          <w:p>
+            <w:pPr>
+              <w:pStyle w:val="Compact"/>
+              <w:jc w:val="left"/>
+            </w:pPr>
+            <w:r>
+              <w:t xml:space="preserve">1.48 [0.90, 2.07]</w:t>
+            </w:r>
+          </w:p>
+        </w:tc>
+        <w:tc>
+          <w:tcPr/>
+          <w:p>
+            <w:pPr>
+              <w:pStyle w:val="Compact"/>
+              <w:jc w:val="left"/>
+            </w:pPr>
+            <w:r>
+              <w:t xml:space="preserve">1.35 [0.77, 1.93]</w:t>
+            </w:r>
+          </w:p>
+        </w:tc>
+        <w:tc>
+          <w:tcPr/>
+          <w:p>
+            <w:pPr>
+              <w:pStyle w:val="Compact"/>
+              <w:jc w:val="left"/>
+            </w:pPr>
+            <w:r>
+              <w:t xml:space="preserve">0.15 [−0.37, 0.67]</w:t>
+            </w:r>
+          </w:p>
+        </w:tc>
+      </w:tr>
+      <w:tr>
+        <w:tc>
+          <w:tcPr/>
+          <w:p>
+            <w:pPr>
+              <w:pStyle w:val="Compact"/>
+              <w:jc w:val="left"/>
+            </w:pPr>
+            <w:r>
+              <w:t xml:space="preserve">Need Preventive</w:t>
+            </w:r>
+          </w:p>
+        </w:tc>
+        <w:tc>
+          <w:tcPr/>
+          <w:p>
+            <w:pPr>
+              <w:pStyle w:val="Compact"/>
+              <w:jc w:val="left"/>
+            </w:pPr>
+            <w:r>
+              <w:t xml:space="preserve">1.17 [0.60, 1.72]</w:t>
+            </w:r>
+          </w:p>
+        </w:tc>
+        <w:tc>
+          <w:tcPr/>
+          <w:p>
+            <w:pPr>
+              <w:pStyle w:val="Compact"/>
+              <w:jc w:val="left"/>
+            </w:pPr>
+            <w:r>
+              <w:t xml:space="preserve">1.20 [0.64, 1.77]</w:t>
+            </w:r>
+          </w:p>
+        </w:tc>
+        <w:tc>
+          <w:tcPr/>
+          <w:p>
+            <w:pPr>
+              <w:pStyle w:val="Compact"/>
+              <w:jc w:val="left"/>
+            </w:pPr>
+            <w:r>
+              <w:t xml:space="preserve">−0.28 [−0.80, 0.25]</w:t>
+            </w:r>
+          </w:p>
+        </w:tc>
+      </w:tr>
+    </w:tbl>
+    <w:p>
+      <w:pPr>
+        <w:pStyle w:val="BodyText"/>
+      </w:pPr>
+      <w:r>
+        <w:rPr>
+          <w:iCs/>
+          <w:i/>
+        </w:rPr>
+        <w:t xml:space="preserve">Note: |g| ≈ 0.2 small, 0.5 medium, 0.8 large, ≥ 1.2 very large.</w:t>
+      </w:r>
+    </w:p>
+    <w:p>
+      <w:pPr>
+        <w:pStyle w:val="BodyText"/>
+      </w:pPr>
+      <w:r>
+        <w:rPr>
+          <w:bCs/>
+          <w:b/>
+        </w:rPr>
+        <w:t xml:space="preserve">Figure 2</w:t>
+      </w:r>
+      <w:r>
+        <w:t xml:space="preserve"> </w:t>
+      </w:r>
+      <w:r>
+        <w:rPr>
+          <w:iCs/>
+          <w:i/>
+        </w:rPr>
+        <w:t xml:space="preserve">(insert here — forest plot:</w:t>
+      </w:r>
+      <w:r>
+        <w:rPr>
+          <w:iCs/>
+          <w:i/>
+        </w:rPr>
+        <w:t xml:space="preserve"> </w:t>
+      </w:r>
+      <w:r>
+        <w:rPr>
+          <w:iCs/>
+          <w:i/>
+        </w:rPr>
+        <w:t xml:space="preserve">“</w:t>
+      </w:r>
+      <w:r>
+        <w:rPr>
+          <w:iCs/>
+          <w:i/>
+        </w:rPr>
+        <w:t xml:space="preserve">Between-group Hedges’ g at Final Follow-up (T3), Group1/Group2 vs Group3, based on Δ = Baseline−Follow-up</w:t>
+      </w:r>
+      <w:r>
+        <w:rPr>
+          <w:iCs/>
+          <w:i/>
+        </w:rPr>
+        <w:t xml:space="preserve">”</w:t>
+      </w:r>
+      <w:r>
+        <w:rPr>
+          <w:iCs/>
+          <w:i/>
+        </w:rPr>
+        <w:t xml:space="preserve">)</w:t>
+      </w:r>
+      <w:r>
+        <w:t xml:space="preserve">. This figure visualizes the Table 10 data above:</w:t>
+      </w:r>
+    </w:p>
+    <w:tbl>
+      <w:tblPr>
+        <w:tblStyle w:val="Table"/>
+        <w:tblW w:type="pct" w:w="5000"/>
+        <w:tblLook w:firstRow="1" w:lastRow="0" w:firstColumn="0" w:lastColumn="0" w:noHBand="0" w:noVBand="0" w:val="0020"/>
+        <w:jc w:val="start"/>
+      </w:tblPr>
+      <w:tblGrid>
+        <w:gridCol w:w="3960"/>
+        <w:gridCol w:w="3960"/>
+      </w:tblGrid>
+      <w:tr>
+        <w:trPr>
+          <w:tblHeader w:val="true"/>
+        </w:trPr>
+        <w:tc>
+          <w:tcPr/>
+          <w:p>
+            <w:pPr>
+              <w:pStyle w:val="Compact"/>
+              <w:jc w:val="left"/>
+            </w:pPr>
+            <w:r>
+              <w:t xml:space="preserve">Comparison</w:t>
+            </w:r>
+          </w:p>
+        </w:tc>
+        <w:tc>
+          <w:tcPr/>
+          <w:p>
+            <w:pPr>
+              <w:pStyle w:val="Compact"/>
+              <w:jc w:val="left"/>
+            </w:pPr>
+            <w:r>
+              <w:t xml:space="preserve">g [95% CI]</w:t>
+            </w:r>
+          </w:p>
+        </w:tc>
+      </w:tr>
+      <w:tr>
+        <w:tc>
+          <w:tcPr/>
+          <w:p>
+            <w:pPr>
+              <w:pStyle w:val="Compact"/>
+              <w:jc w:val="left"/>
+            </w:pPr>
+            <w:r>
+              <w:t xml:space="preserve">MPQ5 — Group1 vs Group3</w:t>
+            </w:r>
+          </w:p>
+        </w:tc>
+        <w:tc>
+          <w:tcPr/>
+          <w:p>
+            <w:pPr>
+              <w:pStyle w:val="Compact"/>
+              <w:jc w:val="left"/>
+            </w:pPr>
+            <w:r>
+              <w:t xml:space="preserve">1.52 [0.93, 2.10]</w:t>
+            </w:r>
+          </w:p>
+        </w:tc>
+      </w:tr>
+      <w:tr>
+        <w:tc>
+          <w:tcPr/>
+          <w:p>
+            <w:pPr>
+              <w:pStyle w:val="Compact"/>
+              <w:jc w:val="left"/>
+            </w:pPr>
+            <w:r>
+              <w:t xml:space="preserve">MPQ5 — Group2 vs Group3</w:t>
+            </w:r>
+          </w:p>
+        </w:tc>
+        <w:tc>
+          <w:tcPr/>
+          <w:p>
+            <w:pPr>
+              <w:pStyle w:val="Compact"/>
+              <w:jc w:val="left"/>
+            </w:pPr>
+            <w:r>
+              <w:t xml:space="preserve">1.75 [1.14, 2.37]</w:t>
+            </w:r>
+          </w:p>
+        </w:tc>
+      </w:tr>
+      <w:tr>
+        <w:tc>
+          <w:tcPr/>
+          <w:p>
+            <w:pPr>
+              <w:pStyle w:val="Compact"/>
+              <w:jc w:val="left"/>
+            </w:pPr>
+            <w:r>
+              <w:t xml:space="preserve">VAS — Group1 vs Group3</w:t>
+            </w:r>
+          </w:p>
+        </w:tc>
+        <w:tc>
+          <w:tcPr/>
+          <w:p>
+            <w:pPr>
+              <w:pStyle w:val="Compact"/>
+              <w:jc w:val="left"/>
+            </w:pPr>
+            <w:r>
+              <w:t xml:space="preserve">1.84 [1.22, 2.46]</w:t>
+            </w:r>
+          </w:p>
+        </w:tc>
+      </w:tr>
+      <w:tr>
+        <w:tc>
+          <w:tcPr/>
+          <w:p>
+            <w:pPr>
+              <w:pStyle w:val="Compact"/>
+              <w:jc w:val="left"/>
+            </w:pPr>
+            <w:r>
+              <w:t xml:space="preserve">VAS — Group2 vs Group3</w:t>
+            </w:r>
+          </w:p>
+        </w:tc>
+        <w:tc>
+          <w:tcPr/>
+          <w:p>
+            <w:pPr>
+              <w:pStyle w:val="Compact"/>
+              <w:jc w:val="left"/>
+            </w:pPr>
+            <w:r>
+              <w:t xml:space="preserve">1.35 [0.77, 1.93]</w:t>
+            </w:r>
+          </w:p>
+        </w:tc>
+      </w:tr>
+      <w:tr>
+        <w:tc>
+          <w:tcPr/>
+          <w:p>
+            <w:pPr>
+              <w:pStyle w:val="Compact"/>
+              <w:jc w:val="left"/>
+            </w:pPr>
+            <w:r>
+              <w:t xml:space="preserve">MIDAS — Group1 vs Group3</w:t>
+            </w:r>
+          </w:p>
+        </w:tc>
+        <w:tc>
+          <w:tcPr/>
+          <w:p>
+            <w:pPr>
+              <w:pStyle w:val="Compact"/>
+              <w:jc w:val="left"/>
+            </w:pPr>
+            <w:r>
+              <w:t xml:space="preserve">1.11 [0.55, 1.66]</w:t>
+            </w:r>
+          </w:p>
+        </w:tc>
+      </w:tr>
+      <w:tr>
+        <w:tc>
+          <w:tcPr/>
+          <w:p>
+            <w:pPr>
+              <w:pStyle w:val="Compact"/>
+              <w:jc w:val="left"/>
+            </w:pPr>
+            <w:r>
+              <w:t xml:space="preserve">MIDAS — Group2 vs Group3</w:t>
+            </w:r>
+          </w:p>
+        </w:tc>
+        <w:tc>
+          <w:tcPr/>
+          <w:p>
+            <w:pPr>
+              <w:pStyle w:val="Compact"/>
+              <w:jc w:val="left"/>
+            </w:pPr>
+            <w:r>
+              <w:t xml:space="preserve">0.66 [0.12, 1.19]</w:t>
+            </w:r>
+          </w:p>
+        </w:tc>
+      </w:tr>
+      <w:tr>
+        <w:tc>
+          <w:tcPr/>
+          <w:p>
+            <w:pPr>
+              <w:pStyle w:val="Compact"/>
+              <w:jc w:val="left"/>
+            </w:pPr>
+            <w:r>
+              <w:t xml:space="preserve">HIT-6 — Group1 vs Group3</w:t>
+            </w:r>
+          </w:p>
+        </w:tc>
+        <w:tc>
+          <w:tcPr/>
+          <w:p>
+            <w:pPr>
+              <w:pStyle w:val="Compact"/>
+              <w:jc w:val="left"/>
+            </w:pPr>
+            <w:r>
+              <w:t xml:space="preserve">2.14 [1.49, 2.79]</w:t>
+            </w:r>
+          </w:p>
+        </w:tc>
+      </w:tr>
+      <w:tr>
+        <w:tc>
+          <w:tcPr/>
+          <w:p>
+            <w:pPr>
+              <w:pStyle w:val="Compact"/>
+              <w:jc w:val="left"/>
+            </w:pPr>
+            <w:r>
+              <w:t xml:space="preserve">HIT-6 — Group2 vs Group3</w:t>
+            </w:r>
+          </w:p>
+        </w:tc>
+        <w:tc>
+          <w:tcPr/>
+          <w:p>
+            <w:pPr>
+              <w:pStyle w:val="Compact"/>
+              <w:jc w:val="left"/>
+            </w:pPr>
+            <w:r>
+              <w:t xml:space="preserve">2.44 [1.75, 3.14]</w:t>
+            </w:r>
+          </w:p>
+        </w:tc>
+      </w:tr>
+      <w:tr>
+        <w:tc>
+          <w:tcPr/>
+          <w:p>
+            <w:pPr>
+              <w:pStyle w:val="Compact"/>
+              <w:jc w:val="left"/>
+            </w:pPr>
+            <w:r>
+              <w:t xml:space="preserve">Frequency of Preventive Med. Use — Group1 vs Group3</w:t>
+            </w:r>
+          </w:p>
+        </w:tc>
+        <w:tc>
+          <w:tcPr/>
+          <w:p>
+            <w:pPr>
+              <w:pStyle w:val="Compact"/>
+              <w:jc w:val="left"/>
+            </w:pPr>
+            <w:r>
+              <w:t xml:space="preserve">1.48 [0.90, 2.07]</w:t>
+            </w:r>
+          </w:p>
+        </w:tc>
+      </w:tr>
+      <w:tr>
+        <w:tc>
+          <w:tcPr/>
+          <w:p>
+            <w:pPr>
+              <w:pStyle w:val="Compact"/>
+              <w:jc w:val="left"/>
+            </w:pPr>
+            <w:r>
+              <w:t xml:space="preserve">Frequency of Preventive Med. Use — Group2 vs Group3</w:t>
+            </w:r>
+          </w:p>
+        </w:tc>
+        <w:tc>
+          <w:tcPr/>
+          <w:p>
+            <w:pPr>
+              <w:pStyle w:val="Compact"/>
+              <w:jc w:val="left"/>
+            </w:pPr>
+            <w:r>
+              <w:t xml:space="preserve">1.35 [0.77, 1.93]</w:t>
+            </w:r>
+          </w:p>
+        </w:tc>
+      </w:tr>
+      <w:tr>
+        <w:tc>
+          <w:tcPr/>
+          <w:p>
+            <w:pPr>
+              <w:pStyle w:val="Compact"/>
+              <w:jc w:val="left"/>
+            </w:pPr>
+            <w:r>
+              <w:t xml:space="preserve">Need for Preventive Medication — Group1 vs Group3</w:t>
+            </w:r>
+          </w:p>
+        </w:tc>
+        <w:tc>
+          <w:tcPr/>
+          <w:p>
+            <w:pPr>
+              <w:pStyle w:val="Compact"/>
+              <w:jc w:val="left"/>
+            </w:pPr>
+            <w:r>
+              <w:t xml:space="preserve">1.17 [0.60, 1.72]</w:t>
+            </w:r>
+          </w:p>
+        </w:tc>
+      </w:tr>
+      <w:tr>
+        <w:tc>
+          <w:tcPr/>
+          <w:p>
+            <w:pPr>
+              <w:pStyle w:val="Compact"/>
+              <w:jc w:val="left"/>
+            </w:pPr>
+            <w:r>
+              <w:t xml:space="preserve">Need for Preventive Medication — Group2 vs Group3</w:t>
+            </w:r>
+          </w:p>
+        </w:tc>
+        <w:tc>
+          <w:tcPr/>
+          <w:p>
+            <w:pPr>
+              <w:pStyle w:val="Compact"/>
+              <w:jc w:val="left"/>
+            </w:pPr>
+            <w:r>
+              <w:t xml:space="preserve">1.20 [0.64, 1.77]</w:t>
             </w:r>
           </w:p>
         </w:tc>

</xml_diff>

<commit_message>
Q1 peer-review pass: fix orphan reference, generate missing Figure 2 forest plot, fix CONSORT arrow bug, refine effect-size wording
Co-authored-by: Arshiya Asadi <arshiyaasadi@users.noreply.github.com>
</commit_message>
<xml_diff>
--- a/paper-export/TENS-Migraine-Trial.docx
+++ b/paper-export/TENS-Migraine-Trial.docx
@@ -366,7 +366,7 @@
         <w:pStyle w:val="BodyText"/>
       </w:pPr>
       <w:r>
-        <w:t xml:space="preserve">Neuromodulation targeting peripheral nerves has emerged as a promising approach to modulate nociceptive signaling and potentially reduce migraine burden [12,13]. Transcutaneous electrical nerve stimulation (TENS), delivering low-voltage pulsed currents across intact skin, is a non-invasive modality designed to stimulate peripheral nerves for pain control [14]. Its analgesic potential, supported by the gate control theory, has prompted investigations into its utility for migraine [15].</w:t>
+        <w:t xml:space="preserve">Neuromodulation targeting peripheral nerves has emerged as a promising approach to modulate nociceptive signaling and potentially reduce migraine burden [12,13,27]. Transcutaneous electrical nerve stimulation (TENS), delivering low-voltage pulsed currents across intact skin, is a non-invasive modality designed to stimulate peripheral nerves for pain control [14]. Its analgesic potential, supported by the gate control theory, has prompted investigations into its utility for migraine [15].</w:t>
       </w:r>
     </w:p>
     <w:p>
@@ -843,7 +843,7 @@
     </w:p>
     <w:bookmarkEnd w:id="32"/>
     <w:bookmarkEnd w:id="33"/>
-    <w:bookmarkStart w:id="44" w:name="results"/>
+    <w:bookmarkStart w:id="47" w:name="results"/>
     <w:p>
       <w:pPr>
         <w:pStyle w:val="Heading1"/>
@@ -3222,7 +3222,7 @@
       </w:tr>
     </w:tbl>
     <w:bookmarkEnd w:id="41"/>
-    <w:bookmarkStart w:id="42" w:name="standardized-effect-sizes-hedges-g"/>
+    <w:bookmarkStart w:id="45" w:name="standardized-effect-sizes-hedges-g"/>
     <w:p>
       <w:pPr>
         <w:pStyle w:val="Heading2"/>
@@ -3244,7 +3244,7 @@
         <w:pStyle w:val="BodyText"/>
       </w:pPr>
       <w:r>
-        <w:t xml:space="preserve">Within-group Hedges’ g values for the baseline-to-1-month interval showed consistently large effects for supraorbital TENS across all clinical outcomes (g = 1.54–2.96), moderate-to-large effects for infraorbital TENS (g = 0.84–2.18), and negligible-to-small effects for sham (Table 8). Random-effects pooled estimates likewise indicated large overall treatment effects for pain intensity, headache impact, analgesic use, and preventive medication need.</w:t>
+        <w:t xml:space="preserve">Within-group Hedges’ g values for the baseline-to-1-month interval showed consistently large effects for supraorbital TENS across all clinical outcomes (g = 1.54–2.96), moderate-to-large effects for infraorbital TENS (g = 0.84–2.18), and negligible-to-small effects for sham across most outcomes, with the exception of a medium effect for VAS (g = 0.71) (Table 8). Random-effects pooled estimates likewise indicated large overall treatment effects for pain intensity, headache impact, analgesic use, and preventive medication need.</w:t>
       </w:r>
     </w:p>
     <w:p>
@@ -3784,7 +3784,7 @@
         <w:pStyle w:val="BodyText"/>
       </w:pPr>
       <w:r>
-        <w:t xml:space="preserve">At the 1-month interim assessment, between-group effect sizes already demonstrated large superiority of both active interventions over sham, particularly for headache impact (HIT-6), pain intensity (VAS), and migraine frequency; effect sizes comparing supraorbital and infraorbital stimulation remained trivial to small at this timepoint (Table 9).</w:t>
+        <w:t xml:space="preserve">At the 1-month interim assessment, between-group effect sizes already demonstrated large superiority of both active interventions over sham, particularly for headache impact (HIT-6), pain intensity (VAS), and migraine frequency; effect sizes comparing supraorbital and infraorbital stimulation remained mostly trivial to small at this timepoint, aside from a medium effect for VAS (g = 0.69) (Table 9).</w:t>
       </w:r>
     </w:p>
     <w:p>
@@ -4227,7 +4227,7 @@
         <w:pStyle w:val="BodyText"/>
       </w:pPr>
       <w:r>
-        <w:t xml:space="preserve">At the 3-month (final) follow-up, effect-size estimates confirmed the durability of treatment benefits: both active stimulation protocols showed consistently large between-group effects compared with sham across all clinical outcomes (Hedges’ g generally &gt; 1.0), whereas direct comparisons between supraorbital and infraorbital stimulation yielded trivial-to-small effect sizes with confidence intervals crossing zero (Table 10), reinforcing the Table 7 finding that neither stimulation site demonstrated statistically or clinically significant superiority over the other.</w:t>
+        <w:t xml:space="preserve">At the 3-month (final) follow-up, effect-size estimates confirmed the durability of treatment benefits: both active stimulation protocols showed consistently large between-group effects compared with sham across nearly all clinical outcomes (Hedges’ g generally &gt; 1.0, with one medium-sized exception for MIDAS in the infraorbital-vs-sham contrast, g = 0.66), whereas direct comparisons between supraorbital and infraorbital stimulation yielded trivial-to-small effect sizes with confidence intervals crossing zero (Table 10), reinforcing the Table 7 finding that neither stimulation site demonstrated statistically or clinically significant superiority over the other.</w:t>
       </w:r>
     </w:p>
     <w:p>
@@ -4679,72 +4679,121 @@
     </w:p>
     <w:p>
       <w:pPr>
+        <w:pStyle w:val="CaptionedFigure"/>
+      </w:pPr>
+      <w:r>
+        <w:drawing>
+          <wp:inline>
+            <wp:extent cx="5334000" cy="3424688"/>
+            <wp:effectExtent b="0" l="0" r="0" t="0"/>
+            <wp:docPr descr="Figure 2. Between-group Hedges’ g at final follow-up (T3): Supraorbital vs. Sham and Infraorbital vs. Sham, based on Δ = Baseline − 3 Months (Table 10 data). Squares/circles denote point estimates; horizontal lines denote 95% confidence intervals." title="" id="43" name="Picture"/>
+            <a:graphic>
+              <a:graphicData uri="http://schemas.openxmlformats.org/drawingml/2006/picture">
+                <pic:pic>
+                  <pic:nvPicPr>
+                    <pic:cNvPr descr="forest_plot_t3.png" id="44" name="Picture"/>
+                    <pic:cNvPicPr>
+                      <a:picLocks noChangeArrowheads="1" noChangeAspect="1"/>
+                    </pic:cNvPicPr>
+                  </pic:nvPicPr>
+                  <pic:blipFill>
+                    <a:blip r:embed="rId42"/>
+                    <a:stretch>
+                      <a:fillRect/>
+                    </a:stretch>
+                  </pic:blipFill>
+                  <pic:spPr bwMode="auto">
+                    <a:xfrm>
+                      <a:off x="0" y="0"/>
+                      <a:ext cx="5334000" cy="3424688"/>
+                    </a:xfrm>
+                    <a:prstGeom prst="rect">
+                      <a:avLst/>
+                    </a:prstGeom>
+                    <a:noFill/>
+                    <a:ln w="9525">
+                      <a:noFill/>
+                      <a:headEnd/>
+                      <a:tailEnd/>
+                    </a:ln>
+                  </pic:spPr>
+                </pic:pic>
+              </a:graphicData>
+            </a:graphic>
+          </wp:inline>
+        </w:drawing>
+      </w:r>
+    </w:p>
+    <w:p>
+      <w:pPr>
+        <w:pStyle w:val="ImageCaption"/>
+      </w:pPr>
+      <w:r>
+        <w:t xml:space="preserve">Figure 2. Between-group Hedges’ g at final follow-up (T3): Supraorbital vs. Sham and Infraorbital vs. Sham, based on Δ = Baseline − 3 Months (Table 10 data). Squares/circles denote point estimates; horizontal lines denote 95% confidence intervals.</w:t>
+      </w:r>
+    </w:p>
+    <w:bookmarkEnd w:id="45"/>
+    <w:bookmarkStart w:id="46" w:name="adverse-events-and-tolerability"/>
+    <w:p>
+      <w:pPr>
+        <w:pStyle w:val="Heading2"/>
+      </w:pPr>
+      <w:r>
+        <w:t xml:space="preserve">3.5. Adverse Events and Tolerability</w:t>
+      </w:r>
+    </w:p>
+    <w:p>
+      <w:pPr>
+        <w:pStyle w:val="FirstParagraph"/>
+      </w:pPr>
+      <w:r>
+        <w:t xml:space="preserve">In both active intervention groups, the most commonly reported adverse effects were mild, expected stimulation-related sensations at the electrode site, assessed by open-ended clinician inquiry at each treatment session. These categories were not mutually exclusive, as participants could report more than one sensation. Itching at the electrode site was reported by 9/28 (32.1%) participants in the supraorbital group, 8/27 (29.6%) in the infraorbital group, and 3/28 (10.7%) in the sham group; paresthesia/tingling was reported by 12/28 (42.9%) and 11/27 (40.7%) in the supraorbital and infraorbital groups, respectively, but by no participants in the sham group (0/28), consistent with the absence of delivered current in this arm. The lower but non-zero rate of itching in the sham group likely reflects a non-specific skin reaction to the electrode adhesive/gel, common to all three groups, whereas the higher rates in the active groups may additionally reflect a stimulation-related component. All reported sensations in the active groups were transient, did not require treatment discontinuation, and were consistent with the known tolerability profile of TENS, which is generally well tolerated with mild, self-limiting skin-related adverse effects and no serious adverse events reported in large-scale reviews [32]. No serious adverse events were reported in any group. None of the 5 participants who did not provide complete 3-month outcome data (Section 2.2, Figure 1) discontinued due to an adverse event. The open-ended capture method is acknowledged as a limitation (Section 4.8), as milder or non-obvious effects may have been under-reported; the complete absence of paresthesia in the sham group, despite a low background rate of itching, is also discussed in relation to blinding integrity (Section 4.8).</w:t>
+      </w:r>
+    </w:p>
+    <w:bookmarkEnd w:id="46"/>
+    <w:bookmarkEnd w:id="47"/>
+    <w:bookmarkStart w:id="56" w:name="discussion"/>
+    <w:p>
+      <w:pPr>
+        <w:pStyle w:val="Heading1"/>
+      </w:pPr>
+      <w:r>
+        <w:t xml:space="preserve">4. Discussion</w:t>
+      </w:r>
+    </w:p>
+    <w:bookmarkStart w:id="48" w:name="overview-of-main-findings"/>
+    <w:p>
+      <w:pPr>
+        <w:pStyle w:val="Heading2"/>
+      </w:pPr>
+      <w:r>
+        <w:t xml:space="preserve">4.1. Overview of Main Findings</w:t>
+      </w:r>
+    </w:p>
+    <w:p>
+      <w:pPr>
+        <w:pStyle w:val="FirstParagraph"/>
+      </w:pPr>
+      <w:r>
+        <w:t xml:space="preserve">The present randomized sham-controlled trial was designed to compare the therapeutic effects of TENS applied over two major sensory branches of the trigeminal nerve — the supraorbital and infraorbital nerves — in patients with migraine. Both stimulation protocols resulted in significant improvements in migraine frequency (the primary outcome), pain intensity, migraine-related disability, headache impact, oral analgesic consumption, and need for preventive medication as assessed by MPQ-5. At 3 months, both interventions produced comparable clinical benefits, with no statistically significant superiority between stimulation sites; because the trial was neither powered nor pre-specified for equivalence or non-inferiority testing, this finding should be read as inconclusive for the site comparison rather than as proof of equivalence, and should be weighed alongside the site-mismatched sham design described in Section 2.4.</w:t>
+      </w:r>
+    </w:p>
+    <w:p>
+      <w:pPr>
         <w:pStyle w:val="BodyText"/>
       </w:pPr>
       <w:r>
-        <w:rPr>
-          <w:bCs/>
-          <w:b/>
-        </w:rPr>
-        <w:t xml:space="preserve">Figure 2.</w:t>
-      </w:r>
-      <w:r>
-        <w:t xml:space="preserve"> </w:t>
-      </w:r>
-      <w:r>
-        <w:rPr>
-          <w:iCs/>
-          <w:i/>
-        </w:rPr>
-        <w:t xml:space="preserve">(insert here — forest plot:</w:t>
-      </w:r>
-      <w:r>
-        <w:rPr>
-          <w:iCs/>
-          <w:i/>
-        </w:rPr>
-        <w:t xml:space="preserve"> </w:t>
-      </w:r>
-      <w:r>
-        <w:rPr>
-          <w:iCs/>
-          <w:i/>
-        </w:rPr>
-        <w:t xml:space="preserve">“</w:t>
-      </w:r>
-      <w:r>
-        <w:rPr>
-          <w:iCs/>
-          <w:i/>
-        </w:rPr>
-        <w:t xml:space="preserve">Between-group Hedges’ g at Final Follow-up (T3), Group1/Group2 vs Group3, based on Δ = Baseline−Follow-up</w:t>
-      </w:r>
-      <w:r>
-        <w:rPr>
-          <w:iCs/>
-          <w:i/>
-        </w:rPr>
-        <w:t xml:space="preserve">”</w:t>
-      </w:r>
-      <w:r>
-        <w:rPr>
-          <w:iCs/>
-          <w:i/>
-        </w:rPr>
-        <w:t xml:space="preserve">)</w:t>
-      </w:r>
-      <w:r>
-        <w:t xml:space="preserve">. This figure visualizes the Table 10 data above.</w:t>
-      </w:r>
-    </w:p>
-    <w:bookmarkEnd w:id="42"/>
-    <w:bookmarkStart w:id="43" w:name="adverse-events-and-tolerability"/>
+        <w:t xml:space="preserve">Beyond statistical significance, the magnitude of improvement appears clinically meaningful. Reductions of approximately 45–50% in pain intensity, together with substantial improvements in MIDAS and HIT-6 scores, suggest that the observed benefits are likely to translate into tangible improvements in daily functioning and quality of life. Within-group Hedges’ g values calculated for the baseline-to-1-month interval reinforce this impression: supraorbital TENS showed consistently large effects across all clinical outcomes (g = 1.54–2.96), whereas infraorbital TENS showed moderate-to-large effects (g = 0.84–2.18), while sham stimulation produced negligible or small effects across most outcomes (Table 8, Section 3.4). However, interpretation of the active-versus-sham contrasts must account for the fact that (a) all outcomes were patient-reported, and (b) complete sensory blinding of the sham arm cannot be assumed, since no current was delivered in that condition (Section 2.4); this raises the possibility that expectation effects contributed to some portion of the observed effect sizes, alongside a genuine physiological effect.</w:t>
+      </w:r>
+    </w:p>
+    <w:bookmarkEnd w:id="48"/>
+    <w:bookmarkStart w:id="49" w:name="comparison-with-existing-literature"/>
     <w:p>
       <w:pPr>
         <w:pStyle w:val="Heading2"/>
       </w:pPr>
       <w:r>
-        <w:t xml:space="preserve">3.5. Adverse Events and Tolerability</w:t>
+        <w:t xml:space="preserve">4.2. Comparison with Existing Literature</w:t>
       </w:r>
     </w:p>
     <w:p>
@@ -4752,35 +4801,7 @@
         <w:pStyle w:val="FirstParagraph"/>
       </w:pPr>
       <w:r>
-        <w:t xml:space="preserve">In both active intervention groups, the most commonly reported adverse effects were mild, expected stimulation-related sensations at the electrode site, assessed by open-ended clinician inquiry at each treatment session. These categories were not mutually exclusive, as participants could report more than one sensation. Itching at the electrode site was reported by 9/28 (32.1%) participants in the supraorbital group, 8/27 (29.6%) in the infraorbital group, and 3/28 (10.7%) in the sham group; paresthesia/tingling was reported by 12/28 (42.9%) and 11/27 (40.7%) in the supraorbital and infraorbital groups, respectively, but by no participants in the sham group (0/28), consistent with the absence of delivered current in this arm. The lower but non-zero rate of itching in the sham group likely reflects a non-specific skin reaction to the electrode adhesive/gel, common to all three groups, whereas the higher rates in the active groups may additionally reflect a stimulation-related component. All reported sensations in the active groups were transient, did not require treatment discontinuation, and were consistent with the known tolerability profile of TENS, which is generally well tolerated with mild, self-limiting skin-related adverse effects and no serious adverse events reported in large-scale reviews [32]. No serious adverse events were reported in any group. None of the 5 participants who did not provide complete 3-month outcome data (Section 2.2, Figure 1) discontinued due to an adverse event. The open-ended capture method is acknowledged as a limitation (Section 4.8), as milder or non-obvious effects may have been under-reported; the complete absence of paresthesia in the sham group, despite a low background rate of itching, is also discussed in relation to blinding integrity (Section 4.8).</w:t>
-      </w:r>
-    </w:p>
-    <w:bookmarkEnd w:id="43"/>
-    <w:bookmarkEnd w:id="44"/>
-    <w:bookmarkStart w:id="53" w:name="discussion"/>
-    <w:p>
-      <w:pPr>
-        <w:pStyle w:val="Heading1"/>
-      </w:pPr>
-      <w:r>
-        <w:t xml:space="preserve">4. Discussion</w:t>
-      </w:r>
-    </w:p>
-    <w:bookmarkStart w:id="45" w:name="overview-of-main-findings"/>
-    <w:p>
-      <w:pPr>
-        <w:pStyle w:val="Heading2"/>
-      </w:pPr>
-      <w:r>
-        <w:t xml:space="preserve">4.1. Overview of Main Findings</w:t>
-      </w:r>
-    </w:p>
-    <w:p>
-      <w:pPr>
-        <w:pStyle w:val="FirstParagraph"/>
-      </w:pPr>
-      <w:r>
-        <w:t xml:space="preserve">The present randomized sham-controlled trial was designed to compare the therapeutic effects of TENS applied over two major sensory branches of the trigeminal nerve — the supraorbital and infraorbital nerves — in patients with migraine. Both stimulation protocols resulted in significant improvements in migraine frequency (the primary outcome), pain intensity, migraine-related disability, headache impact, oral analgesic consumption, and need for preventive medication as assessed by MPQ-5. At 3 months, both interventions produced comparable clinical benefits, with no statistically significant superiority between stimulation sites; because the trial was neither powered nor pre-specified for equivalence or non-inferiority testing, this finding should be read as inconclusive for the site comparison rather than as proof of equivalence, and should be weighed alongside the site-mismatched sham design described in Section 2.4.</w:t>
+        <w:t xml:space="preserve">Our results align with the growing body of evidence supporting neuromodulation as a non-pharmacological intervention for migraine. The TEAM study (enrollment 2018–2019), the largest multicenter randomized trial evaluating external trigeminal nerve stimulation (eTNS) for acute migraine treatment, reported 2-hour pain freedom of 25.5% with active stimulation versus 18.3% with sham (p = 0.043), and freedom from the most bothersome symptom of 56.4% versus 42.3% (p = 0.001) [33]. Although TEAM assessed acute rather than preventive outcomes, it supports the broader clinical relevance of trigeminal neuromodulation. A systematic review and meta-analysis of neuromodulation RCTs similarly found that selected techniques, including supraorbital TENS for prevention, can improve migraine-related outcomes with a generally favorable safety profile; however, overall evidence quality remains limited and effect sizes are typically small to moderate [34].</w:t>
       </w:r>
     </w:p>
     <w:p>
@@ -4788,33 +4809,7 @@
         <w:pStyle w:val="BodyText"/>
       </w:pPr>
       <w:r>
-        <w:t xml:space="preserve">Beyond statistical significance, the magnitude of improvement appears clinically meaningful. Reductions of approximately 45–50% in pain intensity, together with substantial improvements in MIDAS and HIT-6 scores, suggest that the observed benefits are likely to translate into tangible improvements in daily functioning and quality of life. Within-group Hedges’ g values calculated for the baseline-to-1-month interval reinforce this impression: supraorbital TENS showed consistently large effects across all clinical outcomes (g = 1.54–2.96), whereas infraorbital TENS showed moderate-to-large effects (g = 0.84–2.18), while sham stimulation produced negligible or small effects across most outcomes (Table 8, Section 3.4). However, interpretation of the active-versus-sham contrasts must account for the fact that (a) all outcomes were patient-reported, and (b) complete sensory blinding of the sham arm cannot be assumed, since no current was delivered in that condition (Section 2.4); this raises the possibility that expectation effects contributed to some portion of the observed effect sizes, alongside a genuine physiological effect.</w:t>
-      </w:r>
-    </w:p>
-    <w:bookmarkEnd w:id="45"/>
-    <w:bookmarkStart w:id="46" w:name="comparison-with-existing-literature"/>
-    <w:p>
-      <w:pPr>
-        <w:pStyle w:val="Heading2"/>
-      </w:pPr>
-      <w:r>
-        <w:t xml:space="preserve">4.2. Comparison with Existing Literature</w:t>
-      </w:r>
-    </w:p>
-    <w:p>
-      <w:pPr>
-        <w:pStyle w:val="FirstParagraph"/>
-      </w:pPr>
-      <w:r>
-        <w:t xml:space="preserve">Our results align with the growing body of evidence supporting neuromodulation as a non-pharmacological intervention for migraine. The TEAM study (enrollment 2018–2019), the largest multicenter randomized trial evaluating external trigeminal nerve stimulation (eTNS) for acute migraine treatment, reported 2-hour pain freedom of 25.5% with active stimulation versus 18.3% with sham (p = 0.043), and freedom from the most bothersome symptom of 56.4% versus 42.3% (p = 0.001) [33]. Although TEAM assessed acute rather than preventive outcomes, it supports the broader clinical relevance of trigeminal neuromodulation. A systematic review and meta-analysis of neuromodulation RCTs similarly found that selected techniques, including supraorbital TENS for prevention, can improve migraine-related outcomes with a generally favorable safety profile; however, overall evidence quality remains limited and effect sizes are typically small to moderate [34].</w:t>
-      </w:r>
-    </w:p>
-    <w:p>
-      <w:pPr>
-        <w:pStyle w:val="BodyText"/>
-      </w:pPr>
-      <w:r>
-        <w:t xml:space="preserve">Our findings are consistent with this literature. We observed a 46.3% reduction in pain intensity (VAS) in the supraorbital group and 44.8% in the infraorbital group at 3 months, compared with only 7.1% in the sham group (p &lt; 0.001). These results are directionally comparable to those of Jiang et al., who reported a ≥50% responder rate of 39.22% with transcutaneous supraorbital neurostimulation alone, similar to flunarizine monotherapy (46.15%; p = 0.90) [35]. Effect-size analysis further contextualizes these findings: between-group Hedges’ g at the 1-month interim assessment already demonstrated large superiority of both active interventions over sham, particularly for headache impact (HIT-6), pain intensity (VAS), and migraine frequency, whereas effect sizes comparing supraorbital and infraorbital stimulation remained trivial to small at both 1 and 3 months (Tables 9–10, Section 3.4), supporting the absence of clinically meaningful differences between the two active stimulation sites.</w:t>
+        <w:t xml:space="preserve">Our findings are consistent with this literature. We observed a 46.3% reduction in pain intensity (VAS) in the supraorbital group and 44.8% in the infraorbital group at 3 months, compared with only 7.1% in the sham group (p &lt; 0.001). These results are directionally comparable to those of Jiang et al., who reported a ≥50% responder rate of 39.22% with transcutaneous supraorbital neurostimulation alone, similar to flunarizine monotherapy (46.15%; p = 0.90) [35]. Effect-size analysis further contextualizes these findings: between-group Hedges’ g at the 1-month interim assessment already demonstrated large superiority of both active interventions over sham, particularly for headache impact (HIT-6), pain intensity (VAS), and migraine frequency, whereas effect sizes comparing supraorbital and infraorbital stimulation remained trivial to small for most outcomes at both 1 and 3 months (Tables 9–10, Section 3.4), supporting the absence of clinically meaningful differences between the two active stimulation sites.</w:t>
       </w:r>
     </w:p>
     <w:p>
@@ -4835,8 +4830,8 @@
         <w:t xml:space="preserve">Oral analgesic frequency decreased by 64.6% with supraorbital and 61.6% with infraorbital stimulation; MPQ-5 preventive-need scores decreased by 31.4% and 42.8%, respectively. These findings are clinically relevant because migraine remains a leading cause of disability and pharmacological management is often limited by adverse effects, medication-overuse headache, and poor adherence [11,39]. Evidence from other non-invasive neuromodulation approaches, including non-invasive vagus nerve stimulation, supports the broader concept that peripheral neuromodulation can improve outcomes and, in some settings, reduce medication reliance, although pooled medication-day effects remain mixed [40]. Notably, the sham group also showed an approximately 20.9% reduction in analgesic-use frequency (p &lt; 0.001; Table 6), which may reflect nonspecific effects, regression to the mean, or natural fluctuation, but showed no significant change in MPQ-5 preventive-need scores (p = 0.507). Absolute analgesic use at 3 months nevertheless remained higher in the sham arm than in either active group.</w:t>
       </w:r>
     </w:p>
-    <w:bookmarkEnd w:id="46"/>
-    <w:bookmarkStart w:id="47" w:name="Xb48122bbcade88fc8e5f784343d0cf70683863f"/>
+    <w:bookmarkEnd w:id="49"/>
+    <w:bookmarkStart w:id="50" w:name="Xb48122bbcade88fc8e5f784343d0cf70683863f"/>
     <w:p>
       <w:pPr>
         <w:pStyle w:val="Heading2"/>
@@ -4869,8 +4864,8 @@
         <w:t xml:space="preserve">More broadly, proposed mechanisms for TENS analgesia in migraine include gate-control-mediated suppression of nociceptive transmission via large-diameter Aβ afferents [14], engagement of descending inhibitory pathways (periaqueductal gray, rostral ventromedial medulla, anterior cingulate cortex, hypothalamus, thalamus) [4,36,37], and modulation of serotonergic, GABAergic, and CGRP-related signaling [37]. The absence of significant 3-month differences between supraorbital and infraorbital stimulation is compatible with convergence of trigeminal sensory inputs within the trigeminocervical complex and shared descending inhibitory systems [36,37].</w:t>
       </w:r>
     </w:p>
-    <w:bookmarkEnd w:id="47"/>
-    <w:bookmarkStart w:id="48" w:name="Xecf50c886bb8a7ddd99c86d82328d05bf42bd77"/>
+    <w:bookmarkEnd w:id="50"/>
+    <w:bookmarkStart w:id="51" w:name="Xecf50c886bb8a7ddd99c86d82328d05bf42bd77"/>
     <w:p>
       <w:pPr>
         <w:pStyle w:val="Heading2"/>
@@ -4887,8 +4882,8 @@
         <w:t xml:space="preserve">Significant improvements were observed in both disability (MIDAS) and headache impact (HIT-6). MIDAS decreased by 51.2% in the supraorbital group and 34.7% in the infraorbital group (both p &lt; 0.001). HIT-6 decreased by approximately 20% in both active groups, moving from the severe-impact range (≥ 60) to little or no impact in the supraorbital group (49.48) and to some impact in the infraorbital group (51.40) [29]. A reduction of approximately 5 points on the HIT-6 is generally considered clinically meaningful for within-person change [38]; both active groups exceeded this threshold (supraorbital: −13.1 points; infraorbital: −12.8 points). Systematic evaluation of external trigeminal nerve stimulation supports a favorable safety and tolerability profile, although pooled effects of eTNS alone are not uniformly significant across all migraine endpoints [43].</w:t>
       </w:r>
     </w:p>
-    <w:bookmarkEnd w:id="48"/>
-    <w:bookmarkStart w:id="49" w:name="comparison-between-active-groups"/>
+    <w:bookmarkEnd w:id="51"/>
+    <w:bookmarkStart w:id="52" w:name="comparison-between-active-groups"/>
     <w:p>
       <w:pPr>
         <w:pStyle w:val="Heading2"/>
@@ -5240,8 +5235,8 @@
         </w:tc>
       </w:tr>
     </w:tbl>
-    <w:bookmarkEnd w:id="49"/>
-    <w:bookmarkStart w:id="50" w:name="clinical-implications"/>
+    <w:bookmarkEnd w:id="52"/>
+    <w:bookmarkStart w:id="53" w:name="clinical-implications"/>
     <w:p>
       <w:pPr>
         <w:pStyle w:val="Heading2"/>
@@ -5266,8 +5261,8 @@
         <w:t xml:space="preserve">The non-invasive nature, favorable safety profile (Section 3.5), and demonstrated efficacy of TENS support its consideration within contemporary migraine management pathways. European expert guidance and American Headache Society consensus support neuromodulation as an option for selected patients, particularly those who are refractory to or intolerant of pharmacological therapies [41,42]. The significant reduction in medication use suggests that TENS could help mitigate medication-overuse headache, which affects approximately 1–2% of the general population and contributes substantially to chronic migraine [11,39]. Because the present protocol evaluated repeated preventive sessions with follow-up to 3 months, claims of acute abortive efficacy should be tested in dedicated acute-treatment designs. TENS may also be integrated into multidisciplinary migraine rehabilitation programs that include lifestyle modification, physiotherapy, exercise therapy, stress management, and psychological interventions [13,41].</w:t>
       </w:r>
     </w:p>
-    <w:bookmarkEnd w:id="50"/>
-    <w:bookmarkStart w:id="51" w:name="methodological-strengths"/>
+    <w:bookmarkEnd w:id="53"/>
+    <w:bookmarkStart w:id="54" w:name="methodological-strengths"/>
     <w:p>
       <w:pPr>
         <w:pStyle w:val="Heading2"/>
@@ -5284,8 +5279,8 @@
         <w:t xml:space="preserve">Strengths include a randomized sham-controlled design, investigator-blinded outcome assessment, matched session procedures across arms, multidimensional outcomes (VAS, MIDAS, HIT-6, migraine frequency, analgesic use, and MPQ-5), successful baseline demographic balance for age and sex, prospective trial registration and ethics approval obtained prior to patient recruitment, and 3-month follow-up. Inclusion of a sham arm with identical electrode placement and schedule to the supraorbital arm allows better separation of stimulation-related effects from nonspecific care effects than an untreated control alone, although complete sensory blinding remains difficult when no current is delivered. To the best of our knowledge, this trial is among the first randomized controlled studies to directly compare transcutaneous electrical stimulation of the supraorbital and infraorbital trigeminal branches in migraine.</w:t>
       </w:r>
     </w:p>
-    <w:bookmarkEnd w:id="51"/>
-    <w:bookmarkStart w:id="52" w:name="limitations-and-future-directions"/>
+    <w:bookmarkEnd w:id="54"/>
+    <w:bookmarkStart w:id="55" w:name="limitations-and-future-directions"/>
     <w:p>
       <w:pPr>
         <w:pStyle w:val="Heading2"/>
@@ -5446,9 +5441,9 @@
         <w:t xml:space="preserve">Future research should include larger, rigorously blinded, site-matched sham-controlled trials with a pre-specified statistical analysis plan; longer follow-up; mechanistic imaging studies; dose-finding designs; and identification of predictors of treatment response.</w:t>
       </w:r>
     </w:p>
-    <w:bookmarkEnd w:id="52"/>
-    <w:bookmarkEnd w:id="53"/>
-    <w:bookmarkStart w:id="54" w:name="conclusions"/>
+    <w:bookmarkEnd w:id="55"/>
+    <w:bookmarkEnd w:id="56"/>
+    <w:bookmarkStart w:id="57" w:name="conclusions"/>
     <w:p>
       <w:pPr>
         <w:pStyle w:val="Heading1"/>
@@ -5481,8 +5476,8 @@
         <w:t xml:space="preserve">Taken together, TENS targeting either trigeminal branch may be considered a candidate non-pharmacological adjunctive option for migraine prevention in similar clinical settings, in patients able to commit to the intensive session schedule used here. Confirmation in larger, site-matched, more rigorously blinded trials with longer follow-up, a pre-specified analysis plan, and verifiable prospective registration is warranted before stronger practice recommendations can be made.</w:t>
       </w:r>
     </w:p>
-    <w:bookmarkEnd w:id="54"/>
-    <w:bookmarkStart w:id="55" w:name="acknowledgments"/>
+    <w:bookmarkEnd w:id="57"/>
+    <w:bookmarkStart w:id="58" w:name="acknowledgments"/>
     <w:p>
       <w:pPr>
         <w:pStyle w:val="Heading1"/>
@@ -5499,8 +5494,8 @@
         <w:t xml:space="preserve">The authors thank all patients who participated in this study and the clinical staff of the Physical Medicine and Rehabilitation clinics at Isfahan University of Medical Sciences for their assistance with recruitment and follow-up assessments.</w:t>
       </w:r>
     </w:p>
-    <w:bookmarkEnd w:id="55"/>
-    <w:bookmarkStart w:id="56" w:name="Xd182db0490b2de20bd2b4e4cc8698599182035f"/>
+    <w:bookmarkEnd w:id="58"/>
+    <w:bookmarkStart w:id="59" w:name="Xd182db0490b2de20bd2b4e4cc8698599182035f"/>
     <w:p>
       <w:pPr>
         <w:pStyle w:val="Heading1"/>
@@ -5517,8 +5512,8 @@
         <w:t xml:space="preserve">The study protocol was approved by the institutional ethics committee of Isfahan University of Medical Sciences (ethics approval code: []). All participants provided written informed consent. The trial was prospectively registered in the Iranian Registry of Clinical Trials (IRCT registration number: []). The study was conducted in accordance with the Declaration of Helsinki.</w:t>
       </w:r>
     </w:p>
-    <w:bookmarkEnd w:id="56"/>
-    <w:bookmarkStart w:id="57" w:name="competing-interests"/>
+    <w:bookmarkEnd w:id="59"/>
+    <w:bookmarkStart w:id="60" w:name="competing-interests"/>
     <w:p>
       <w:pPr>
         <w:pStyle w:val="Heading1"/>
@@ -5535,8 +5530,8 @@
         <w:t xml:space="preserve">The authors declare that they have no competing interests.</w:t>
       </w:r>
     </w:p>
-    <w:bookmarkEnd w:id="57"/>
-    <w:bookmarkStart w:id="58" w:name="funding"/>
+    <w:bookmarkEnd w:id="60"/>
+    <w:bookmarkStart w:id="61" w:name="funding"/>
     <w:p>
       <w:pPr>
         <w:pStyle w:val="Heading1"/>
@@ -5553,8 +5548,8 @@
         <w:t xml:space="preserve">This research received no specific grant from any funding agency in the public, commercial, or not-for-profit sectors.</w:t>
       </w:r>
     </w:p>
-    <w:bookmarkEnd w:id="58"/>
-    <w:bookmarkStart w:id="59" w:name="references"/>
+    <w:bookmarkEnd w:id="61"/>
+    <w:bookmarkStart w:id="62" w:name="references"/>
     <w:p>
       <w:pPr>
         <w:pStyle w:val="Heading1"/>
@@ -6841,7 +6836,7 @@
         <w:t xml:space="preserve">2002;7(1):105–125. doi:10.1037/1082-989X.7.1.105</w:t>
       </w:r>
     </w:p>
-    <w:bookmarkEnd w:id="59"/>
+    <w:bookmarkEnd w:id="62"/>
     <w:sectPr/>
   </w:body>
 </w:document>

</xml_diff>

<commit_message>
Revert ICHD classification references from ICHD-2 to ICHD-3
Co-authored-by: Arshiya Asadi <arshiyaasadi@users.noreply.github.com>
</commit_message>
<xml_diff>
--- a/paper-export/TENS-Migraine-Trial.docx
+++ b/paper-export/TENS-Migraine-Trial.docx
@@ -252,7 +252,7 @@
         <w:t xml:space="preserve"> </w:t>
       </w:r>
       <w:r>
-        <w:t xml:space="preserve">In this single-blind, three-arm randomized controlled trial reported in accordance with CONSORT guidelines, 105 adults with migraine were assessed for eligibility, of whom 17 were excluded prior to randomization. Eighty-eight participants meeting ICHD-2 diagnostic criteria were randomized 1:1:1 to supraorbital TENS (n = 30), infraorbital TENS (n = 29), or sham TENS (n = 29); 83 completed treatment and follow-up and were analyzed. Active stimulation was delivered bilaterally at 100 Hz, intensity titrated to a strong but tolerable sensory level (~10 mA), for 30 minutes per session, six sessions weekly for four weeks. Sham electrodes were placed over the supraorbital nerves without current delivery. The primary outcome was monthly migraine frequency (headache days) at 3 months; secondary outcomes included pain intensity (VAS), disability (MIDAS), headache impact (HIT-6), analgesic-use frequency, and need for preventive medication (MPQ-5).</w:t>
+        <w:t xml:space="preserve">In this single-blind, three-arm randomized controlled trial reported in accordance with CONSORT guidelines, 105 adults with migraine were assessed for eligibility, of whom 17 were excluded prior to randomization. Eighty-eight participants meeting ICHD-3 diagnostic criteria were randomized 1:1:1 to supraorbital TENS (n = 30), infraorbital TENS (n = 29), or sham TENS (n = 29); 83 completed treatment and follow-up and were analyzed. Active stimulation was delivered bilaterally at 100 Hz, intensity titrated to a strong but tolerable sensory level (~10 mA), for 30 minutes per session, six sessions weekly for four weeks. Sham electrodes were placed over the supraorbital nerves without current delivery. The primary outcome was monthly migraine frequency (headache days) at 3 months; secondary outcomes included pain intensity (VAS), disability (MIDAS), headache impact (HIT-6), analgesic-use frequency, and need for preventive medication (MPQ-5).</w:t>
       </w:r>
     </w:p>
     <w:p>
@@ -435,7 +435,7 @@
         <w:pStyle w:val="FirstParagraph"/>
       </w:pPr>
       <w:r>
-        <w:t xml:space="preserve">Eligible participants were adults aged 18–65 years with a confirmed diagnosis of migraine with or without aura according to the International Classification of Headache Disorders, 2nd edition (ICHD-2) criteria (codes 1.1, 1.2.1) [3], and a history of ≥2 migraine attacks per month over the preceding three months. Monthly migraine (headache) frequency was ascertained from a prospective headache diary completed daily throughout the study period. Written informed consent was obtained from all participants.</w:t>
+        <w:t xml:space="preserve">Eligible participants were adults aged 18–65 years with a confirmed diagnosis of migraine with or without aura according to the International Classification of Headache Disorders, 3rd edition (ICHD-3) criteria (codes 1.1, 1.2.1) [3], and a history of ≥2 migraine attacks per month over the preceding three months. Monthly migraine (headache) frequency was ascertained from a prospective headache diary completed daily throughout the study period. Written informed consent was obtained from all participants.</w:t>
       </w:r>
     </w:p>
     <w:p>
@@ -594,7 +594,7 @@
         <w:pStyle w:val="FirstParagraph"/>
       </w:pPr>
       <w:r>
-        <w:t xml:space="preserve">Exclusion criteria comprised: use of prophylactic migraine medication within two weeks prior to enrollment; receipt of preventive interventions (e.g., nerve block, botulinum toxin) within the past year; medication-overuse headache (ICHD-2 code 8.2); concurrent headache disorders; severe psychiatric or systemic illness; pregnancy or lactation; substance abuse; and treatment non-compliance.</w:t>
+        <w:t xml:space="preserve">Exclusion criteria comprised: use of prophylactic migraine medication within two weeks prior to enrollment; receipt of preventive interventions (e.g., nerve block, botulinum toxin) within the past year; medication-overuse headache (ICHD-3 code 8.2); concurrent headache disorders; severe psychiatric or systemic illness; pregnancy or lactation; substance abuse; and treatment non-compliance.</w:t>
       </w:r>
     </w:p>
     <w:bookmarkEnd w:id="29"/>
@@ -5623,7 +5623,7 @@
         <w:pStyle w:val="Compact"/>
       </w:pPr>
       <w:r>
-        <w:t xml:space="preserve">Headache Classification Subcommittee of the International Headache Society. The International Classification of Headache Disorders: 2nd edition.</w:t>
+        <w:t xml:space="preserve">Headache Classification Committee of the International Headache Society (IHS). The International Classification of Headache Disorders, 3rd edition.</w:t>
       </w:r>
       <w:r>
         <w:t xml:space="preserve"> </w:t>
@@ -5639,7 +5639,7 @@
         <w:t xml:space="preserve"> </w:t>
       </w:r>
       <w:r>
-        <w:t xml:space="preserve">2004;24(Suppl 1):9–160. doi:10.1111/j.1468-2982.2003.00824.x</w:t>
+        <w:t xml:space="preserve">2018;38(1):1–211. doi:10.1177/0333102417738202</w:t>
       </w:r>
     </w:p>
     <w:p>

</xml_diff>